<commit_message>
nmv 22 07 2026
</commit_message>
<xml_diff>
--- a/TS Jatai Ghanam Project/TS 2.1/TS 2.1 Ghanam Malayalam Corrections.docx
+++ b/TS Jatai Ghanam Project/TS 2.1/TS 2.1 Ghanam Malayalam Corrections.docx
@@ -1,7 +1,281 @@
 
 <file path=word/document.xml><?xml version="1.0" encoding="utf-8"?>
-<w:document xmlns:wpc="http://schemas.microsoft.com/office/word/2010/wordprocessingCanvas" xmlns:cx="http://schemas.microsoft.com/office/drawing/2014/chartex" xmlns:cx1="http://schemas.microsoft.com/office/drawing/2015/9/8/chartex" xmlns:cx2="http://schemas.microsoft.com/office/drawing/2015/10/21/chartex" xmlns:cx3="http://schemas.microsoft.com/office/drawing/2016/5/9/chartex" xmlns:cx4="http://schemas.microsoft.com/office/drawing/2016/5/10/chartex" xmlns:cx5="http://schemas.microsoft.com/office/drawing/2016/5/11/chartex" xmlns:cx6="http://schemas.microsoft.com/office/drawing/2016/5/12/chartex" xmlns:cx7="http://schemas.microsoft.com/office/drawing/2016/5/13/chartex" xmlns:cx8="http://schemas.microsoft.com/office/drawing/2016/5/14/chartex" xmlns:mc="http://schemas.openxmlformats.org/markup-compatibility/2006" xmlns:aink="http://schemas.microsoft.com/office/drawing/2016/ink" xmlns:am3d="http://schemas.microsoft.com/office/drawing/2017/model3d" xmlns:o="urn:schemas-microsoft-com:office:office" xmlns:oel="http://schemas.microsoft.com/office/2019/extlst" xmlns:r="http://schemas.openxmlformats.org/officeDocument/2006/relationships" xmlns:m="http://schemas.openxmlformats.org/officeDocument/2006/math" xmlns:v="urn:schemas-microsoft-com:vml" xmlns:wp14="http://schemas.microsoft.com/office/word/2010/wordprocessingDrawing" xmlns:wp="http://schemas.openxmlformats.org/drawingml/2006/wordprocessingDrawing" xmlns:w10="urn:schemas-microsoft-com:office:word" xmlns:w="http://schemas.openxmlformats.org/wordprocessingml/2006/main" xmlns:w14="http://schemas.microsoft.com/office/word/2010/wordml" xmlns:w15="http://schemas.microsoft.com/office/word/2012/wordml" xmlns:w16cex="http://schemas.microsoft.com/office/word/2018/wordml/cex" xmlns:w16cid="http://schemas.microsoft.com/office/word/2016/wordml/cid" xmlns:w16="http://schemas.microsoft.com/office/word/2018/wordml" xmlns:w16du="http://schemas.microsoft.com/office/word/2023/wordml/word16du" xmlns:w16sdtdh="http://schemas.microsoft.com/office/word/2020/wordml/sdtdatahash" xmlns:w16se="http://schemas.microsoft.com/office/word/2015/wordml/symex" xmlns:wpg="http://schemas.microsoft.com/office/word/2010/wordprocessingGroup" xmlns:wpi="http://schemas.microsoft.com/office/word/2010/wordprocessingInk" xmlns:wne="http://schemas.microsoft.com/office/word/2006/wordml" xmlns:wps="http://schemas.microsoft.com/office/word/2010/wordprocessingShape" mc:Ignorable="w14 w15 w16se w16cid w16 w16cex w16sdtdh wp14">
+<w:document xmlns:wpc="http://schemas.microsoft.com/office/word/2010/wordprocessingCanvas" xmlns:cx="http://schemas.microsoft.com/office/drawing/2014/chartex" xmlns:cx1="http://schemas.microsoft.com/office/drawing/2015/9/8/chartex" xmlns:cx2="http://schemas.microsoft.com/office/drawing/2015/10/21/chartex" xmlns:cx3="http://schemas.microsoft.com/office/drawing/2016/5/9/chartex" xmlns:cx4="http://schemas.microsoft.com/office/drawing/2016/5/10/chartex" xmlns:cx5="http://schemas.microsoft.com/office/drawing/2016/5/11/chartex" xmlns:cx6="http://schemas.microsoft.com/office/drawing/2016/5/12/chartex" xmlns:cx7="http://schemas.microsoft.com/office/drawing/2016/5/13/chartex" xmlns:cx8="http://schemas.microsoft.com/office/drawing/2016/5/14/chartex" xmlns:mc="http://schemas.openxmlformats.org/markup-compatibility/2006" xmlns:aink="http://schemas.microsoft.com/office/drawing/2016/ink" xmlns:am3d="http://schemas.microsoft.com/office/drawing/2017/model3d" xmlns:o="urn:schemas-microsoft-com:office:office" xmlns:oel="http://schemas.microsoft.com/office/2019/extlst" xmlns:r="http://schemas.openxmlformats.org/officeDocument/2006/relationships" xmlns:m="http://schemas.openxmlformats.org/officeDocument/2006/math" xmlns:v="urn:schemas-microsoft-com:vml" xmlns:wp14="http://schemas.microsoft.com/office/word/2010/wordprocessingDrawing" xmlns:wp="http://schemas.openxmlformats.org/drawingml/2006/wordprocessingDrawing" xmlns:w10="urn:schemas-microsoft-com:office:word" xmlns:w="http://schemas.openxmlformats.org/wordprocessingml/2006/main" xmlns:w14="http://schemas.microsoft.com/office/word/2010/wordml" xmlns:w15="http://schemas.microsoft.com/office/word/2012/wordml" xmlns:w16cex="http://schemas.microsoft.com/office/word/2018/wordml/cex" xmlns:w16cid="http://schemas.microsoft.com/office/word/2016/wordml/cid" xmlns:w16="http://schemas.microsoft.com/office/word/2018/wordml" xmlns:w16du="http://schemas.microsoft.com/office/word/2023/wordml/word16du" xmlns:w16sdtdh="http://schemas.microsoft.com/office/word/2020/wordml/sdtdatahash" xmlns:w16sdtfl="http://schemas.microsoft.com/office/word/2024/wordml/sdtformatlock" xmlns:w16se="http://schemas.microsoft.com/office/word/2015/wordml/symex" xmlns:wpg="http://schemas.microsoft.com/office/word/2010/wordprocessingGroup" xmlns:wpi="http://schemas.microsoft.com/office/word/2010/wordprocessingInk" xmlns:wne="http://schemas.microsoft.com/office/word/2006/wordml" xmlns:wps="http://schemas.microsoft.com/office/word/2010/wordprocessingShape" mc:Ignorable="w14 w15 w16se w16cid w16 w16cex w16sdtdh w16sdtfl w16du wp14">
   <w:body>
+    <w:p>
+      <w:pPr>
+        <w:spacing w:before="0" w:line="240" w:lineRule="auto"/>
+        <w:jc w:val="center"/>
+        <w:rPr>
+          <w:b/>
+          <w:bCs/>
+          <w:sz w:val="32"/>
+          <w:szCs w:val="32"/>
+          <w:u w:val="single"/>
+        </w:rPr>
+      </w:pPr>
+      <w:r>
+        <w:rPr>
+          <w:b/>
+          <w:bCs/>
+          <w:sz w:val="32"/>
+          <w:szCs w:val="32"/>
+          <w:u w:val="single"/>
+        </w:rPr>
+        <w:t xml:space="preserve">TS </w:t>
+      </w:r>
+      <w:r>
+        <w:rPr>
+          <w:b/>
+          <w:bCs/>
+          <w:sz w:val="32"/>
+          <w:szCs w:val="32"/>
+          <w:u w:val="single"/>
+        </w:rPr>
+        <w:t>Ghanam</w:t>
+      </w:r>
+      <w:r>
+        <w:rPr>
+          <w:b/>
+          <w:bCs/>
+          <w:sz w:val="32"/>
+          <w:szCs w:val="32"/>
+          <w:u w:val="single"/>
+        </w:rPr>
+        <w:t xml:space="preserve"> </w:t>
+      </w:r>
+      <w:r>
+        <w:rPr>
+          <w:b/>
+          <w:bCs/>
+          <w:sz w:val="32"/>
+          <w:szCs w:val="32"/>
+          <w:u w:val="single"/>
+        </w:rPr>
+        <w:t xml:space="preserve">– TS 2.1 Malayalam Corrections – Observed till 31st </w:t>
+      </w:r>
+      <w:proofErr w:type="gramStart"/>
+      <w:r>
+        <w:rPr>
+          <w:b/>
+          <w:bCs/>
+          <w:sz w:val="32"/>
+          <w:szCs w:val="32"/>
+          <w:u w:val="single"/>
+        </w:rPr>
+        <w:t>July  2026</w:t>
+      </w:r>
+      <w:proofErr w:type="gramEnd"/>
+    </w:p>
+    <w:p>
+      <w:pPr>
+        <w:spacing w:before="0" w:line="240" w:lineRule="auto"/>
+        <w:jc w:val="center"/>
+        <w:rPr>
+          <w:b/>
+          <w:bCs/>
+          <w:sz w:val="28"/>
+          <w:szCs w:val="32"/>
+        </w:rPr>
+      </w:pPr>
+      <w:r>
+        <w:rPr>
+          <w:b/>
+          <w:bCs/>
+          <w:sz w:val="28"/>
+          <w:szCs w:val="32"/>
+        </w:rPr>
+        <w:t>(ignore those which are already incorporated in your book’s version and date)</w:t>
+      </w:r>
+    </w:p>
+    <w:tbl>
+      <w:tblPr>
+        <w:tblW w:w="14395" w:type="dxa"/>
+        <w:tblInd w:w="-792" w:type="dxa"/>
+        <w:tblBorders>
+          <w:top w:val="single" w:sz="4" w:space="0" w:color="000000"/>
+          <w:left w:val="single" w:sz="4" w:space="0" w:color="000000"/>
+          <w:bottom w:val="single" w:sz="4" w:space="0" w:color="000000"/>
+          <w:right w:val="single" w:sz="4" w:space="0" w:color="000000"/>
+          <w:insideH w:val="single" w:sz="4" w:space="0" w:color="000000"/>
+          <w:insideV w:val="single" w:sz="4" w:space="0" w:color="000000"/>
+        </w:tblBorders>
+        <w:tblLook w:val="04A0" w:firstRow="1" w:lastRow="0" w:firstColumn="1" w:lastColumn="0" w:noHBand="0" w:noVBand="1"/>
+      </w:tblPr>
+      <w:tblGrid>
+        <w:gridCol w:w="7166"/>
+        <w:gridCol w:w="7229"/>
+      </w:tblGrid>
+      <w:tr>
+        <w:tc>
+          <w:tcPr>
+            <w:tcW w:w="7166" w:type="dxa"/>
+          </w:tcPr>
+          <w:p>
+            <w:pPr>
+              <w:spacing w:before="0" w:line="240" w:lineRule="auto"/>
+              <w:jc w:val="center"/>
+              <w:rPr>
+                <w:b/>
+                <w:sz w:val="32"/>
+                <w:szCs w:val="32"/>
+              </w:rPr>
+            </w:pPr>
+            <w:r>
+              <w:rPr>
+                <w:b/>
+                <w:sz w:val="32"/>
+                <w:szCs w:val="32"/>
+              </w:rPr>
+              <w:t>As Printed</w:t>
+            </w:r>
+          </w:p>
+        </w:tc>
+        <w:tc>
+          <w:tcPr>
+            <w:tcW w:w="7229" w:type="dxa"/>
+          </w:tcPr>
+          <w:p>
+            <w:pPr>
+              <w:spacing w:before="0" w:line="240" w:lineRule="auto"/>
+              <w:ind w:right="-18"/>
+              <w:jc w:val="center"/>
+              <w:rPr>
+                <w:b/>
+                <w:sz w:val="32"/>
+                <w:szCs w:val="32"/>
+              </w:rPr>
+            </w:pPr>
+            <w:r>
+              <w:rPr>
+                <w:b/>
+                <w:sz w:val="32"/>
+                <w:szCs w:val="32"/>
+              </w:rPr>
+              <w:t>To be read as or corrected as</w:t>
+            </w:r>
+            <w:r>
+              <w:rPr>
+                <w:b/>
+                <w:sz w:val="32"/>
+                <w:szCs w:val="32"/>
+              </w:rPr>
+              <w:t xml:space="preserve"> </w:t>
+            </w:r>
+          </w:p>
+        </w:tc>
+      </w:tr>
+      <w:tr>
+        <w:trPr>
+          <w:trHeight w:val="488"/>
+        </w:trPr>
+        <w:tc>
+          <w:tcPr>
+            <w:tcW w:w="7166" w:type="dxa"/>
+          </w:tcPr>
+          <w:p>
+            <w:pPr>
+              <w:widowControl w:val="0"/>
+              <w:autoSpaceDE w:val="0"/>
+              <w:autoSpaceDN w:val="0"/>
+              <w:adjustRightInd w:val="0"/>
+              <w:spacing w:before="0" w:line="240" w:lineRule="auto"/>
+              <w:rPr>
+                <w:rFonts w:cs="BRH Malayalam Extra"/>
+                <w:b/>
+                <w:bCs/>
+                <w:szCs w:val="40"/>
+              </w:rPr>
+            </w:pPr>
+            <w:r>
+              <w:rPr>
+                <w:rFonts w:cs="BRH Malayalam Extra"/>
+                <w:b/>
+                <w:bCs/>
+                <w:szCs w:val="40"/>
+              </w:rPr>
+              <w:t>NIL   NIL   Nil</w:t>
+            </w:r>
+          </w:p>
+        </w:tc>
+        <w:tc>
+          <w:tcPr>
+            <w:tcW w:w="7229" w:type="dxa"/>
+          </w:tcPr>
+          <w:p>
+            <w:pPr>
+              <w:widowControl w:val="0"/>
+              <w:autoSpaceDE w:val="0"/>
+              <w:autoSpaceDN w:val="0"/>
+              <w:adjustRightInd w:val="0"/>
+              <w:spacing w:before="0" w:line="240" w:lineRule="auto"/>
+              <w:rPr>
+                <w:rFonts w:cs="BRH Malayalam Extra"/>
+                <w:szCs w:val="40"/>
+              </w:rPr>
+            </w:pPr>
+            <w:r>
+              <w:rPr>
+                <w:rFonts w:cs="BRH Malayalam Extra"/>
+                <w:b/>
+                <w:bCs/>
+                <w:szCs w:val="40"/>
+              </w:rPr>
+              <w:t>NIL   NIL   Nil</w:t>
+            </w:r>
+          </w:p>
+        </w:tc>
+      </w:tr>
+    </w:tbl>
+    <w:p>
+      <w:pPr>
+        <w:spacing w:before="0" w:line="240" w:lineRule="auto"/>
+        <w:jc w:val="center"/>
+        <w:rPr>
+          <w:b/>
+          <w:bCs/>
+          <w:sz w:val="32"/>
+          <w:szCs w:val="32"/>
+          <w:u w:val="single"/>
+        </w:rPr>
+      </w:pPr>
+      <w:r>
+        <w:rPr>
+          <w:b/>
+          <w:bCs/>
+          <w:sz w:val="32"/>
+          <w:szCs w:val="32"/>
+          <w:u w:val="single"/>
+        </w:rPr>
+        <w:t>================</w:t>
+      </w:r>
+    </w:p>
+    <w:p>
+      <w:pPr>
+        <w:spacing w:before="0" w:line="240" w:lineRule="auto"/>
+        <w:jc w:val="center"/>
+        <w:rPr>
+          <w:b/>
+          <w:bCs/>
+          <w:sz w:val="32"/>
+          <w:szCs w:val="32"/>
+          <w:u w:val="single"/>
+        </w:rPr>
+      </w:pPr>
+    </w:p>
+    <w:p>
+      <w:pPr>
+        <w:spacing w:before="0" w:line="240" w:lineRule="auto"/>
+        <w:jc w:val="center"/>
+        <w:rPr>
+          <w:b/>
+          <w:bCs/>
+          <w:sz w:val="32"/>
+          <w:szCs w:val="32"/>
+          <w:u w:val="single"/>
+        </w:rPr>
+      </w:pPr>
+    </w:p>
     <w:p>
       <w:pPr>
         <w:spacing w:before="0" w:line="240" w:lineRule="auto"/>
@@ -134,27 +408,7 @@
           <w:sz w:val="28"/>
           <w:szCs w:val="32"/>
         </w:rPr>
-        <w:t>(</w:t>
-      </w:r>
-      <w:proofErr w:type="gramStart"/>
-      <w:r>
-        <w:rPr>
-          <w:b/>
-          <w:bCs/>
-          <w:sz w:val="28"/>
-          <w:szCs w:val="32"/>
-        </w:rPr>
-        <w:t>ignore</w:t>
-      </w:r>
-      <w:proofErr w:type="gramEnd"/>
-      <w:r>
-        <w:rPr>
-          <w:b/>
-          <w:bCs/>
-          <w:sz w:val="28"/>
-          <w:szCs w:val="32"/>
-        </w:rPr>
-        <w:t xml:space="preserve"> those which are already incorporated in your book’s version and date)</w:t>
+        <w:t>(ignore those which are already incorporated in your book’s version and date)</w:t>
       </w:r>
     </w:p>
     <w:tbl>
@@ -2676,6 +2930,7 @@
                 <w:rFonts w:cs="BRH Malayalam Extra"/>
                 <w:szCs w:val="40"/>
               </w:rPr>
+              <w:lastRenderedPageBreak/>
               <w:t>4</w:t>
             </w:r>
             <w:r>
@@ -3421,7 +3676,6 @@
                 <w:color w:val="000000"/>
                 <w:szCs w:val="40"/>
               </w:rPr>
-              <w:lastRenderedPageBreak/>
               <w:t>23</w:t>
             </w:r>
             <w:r>
@@ -6112,6 +6366,7 @@
                 <w:szCs w:val="40"/>
                 <w:lang w:val="it-IT"/>
               </w:rPr>
+              <w:lastRenderedPageBreak/>
               <w:t>öhxZ£—¥põx „sõ</w:t>
             </w:r>
             <w:r>
@@ -6240,6 +6495,7 @@
                 <w:szCs w:val="40"/>
                 <w:lang w:val="it-IT"/>
               </w:rPr>
+              <w:lastRenderedPageBreak/>
               <w:t>19</w:t>
             </w:r>
             <w:r>
@@ -7838,6 +8094,7 @@
                 <w:szCs w:val="40"/>
                 <w:lang w:val="it-IT"/>
               </w:rPr>
+              <w:lastRenderedPageBreak/>
               <w:t>öhxZ£—¥põx „sõ</w:t>
             </w:r>
             <w:r>
@@ -11591,48 +11848,6 @@
               <w:adjustRightInd w:val="0"/>
               <w:spacing w:before="0" w:line="240" w:lineRule="auto"/>
               <w:rPr>
-                <w:rFonts w:cs="BRH Malayalam Extra"/>
-                <w:color w:val="000000"/>
-                <w:szCs w:val="40"/>
-              </w:rPr>
-            </w:pPr>
-          </w:p>
-          <w:p>
-            <w:pPr>
-              <w:widowControl w:val="0"/>
-              <w:autoSpaceDE w:val="0"/>
-              <w:autoSpaceDN w:val="0"/>
-              <w:adjustRightInd w:val="0"/>
-              <w:spacing w:before="0" w:line="240" w:lineRule="auto"/>
-              <w:rPr>
-                <w:rFonts w:cs="BRH Malayalam Extra"/>
-                <w:color w:val="000000"/>
-                <w:szCs w:val="40"/>
-              </w:rPr>
-            </w:pPr>
-          </w:p>
-          <w:p>
-            <w:pPr>
-              <w:widowControl w:val="0"/>
-              <w:autoSpaceDE w:val="0"/>
-              <w:autoSpaceDN w:val="0"/>
-              <w:adjustRightInd w:val="0"/>
-              <w:spacing w:before="0" w:line="240" w:lineRule="auto"/>
-              <w:rPr>
-                <w:rFonts w:cs="BRH Malayalam Extra"/>
-                <w:color w:val="000000"/>
-                <w:szCs w:val="40"/>
-              </w:rPr>
-            </w:pPr>
-          </w:p>
-          <w:p>
-            <w:pPr>
-              <w:widowControl w:val="0"/>
-              <w:autoSpaceDE w:val="0"/>
-              <w:autoSpaceDN w:val="0"/>
-              <w:adjustRightInd w:val="0"/>
-              <w:spacing w:before="0" w:line="240" w:lineRule="auto"/>
-              <w:rPr>
                 <w:rFonts w:ascii="BRH Malayalam Extra" w:hAnsi="BRH Malayalam Extra" w:cs="BRH Malayalam Extra"/>
                 <w:color w:val="000000"/>
                 <w:sz w:val="32"/>
@@ -12205,61 +12420,18 @@
               <w:adjustRightInd w:val="0"/>
               <w:spacing w:before="0" w:line="240" w:lineRule="auto"/>
               <w:rPr>
-                <w:rFonts w:cs="BRH Malayalam Extra"/>
-                <w:color w:val="000000"/>
+                <w:rFonts w:ascii="BRH Malayalam Extra" w:hAnsi="BRH Malayalam Extra" w:cs="BRH Malayalam Extra"/>
+                <w:color w:val="000000"/>
+                <w:sz w:val="32"/>
                 <w:szCs w:val="40"/>
               </w:rPr>
             </w:pPr>
-          </w:p>
-          <w:p>
-            <w:pPr>
-              <w:widowControl w:val="0"/>
-              <w:autoSpaceDE w:val="0"/>
-              <w:autoSpaceDN w:val="0"/>
-              <w:adjustRightInd w:val="0"/>
-              <w:spacing w:before="0" w:line="240" w:lineRule="auto"/>
-              <w:rPr>
-                <w:rFonts w:cs="BRH Malayalam Extra"/>
-                <w:color w:val="000000"/>
-                <w:szCs w:val="40"/>
-              </w:rPr>
-            </w:pPr>
-          </w:p>
-          <w:p>
-            <w:pPr>
-              <w:widowControl w:val="0"/>
-              <w:autoSpaceDE w:val="0"/>
-              <w:autoSpaceDN w:val="0"/>
-              <w:adjustRightInd w:val="0"/>
-              <w:spacing w:before="0" w:line="240" w:lineRule="auto"/>
-              <w:rPr>
-                <w:rFonts w:cs="BRH Malayalam Extra"/>
-                <w:color w:val="000000"/>
-                <w:szCs w:val="40"/>
-              </w:rPr>
-            </w:pPr>
-          </w:p>
-          <w:p>
-            <w:pPr>
-              <w:widowControl w:val="0"/>
-              <w:autoSpaceDE w:val="0"/>
-              <w:autoSpaceDN w:val="0"/>
-              <w:adjustRightInd w:val="0"/>
-              <w:spacing w:before="0" w:line="240" w:lineRule="auto"/>
-              <w:rPr>
-                <w:rFonts w:ascii="BRH Malayalam Extra" w:hAnsi="BRH Malayalam Extra" w:cs="BRH Malayalam Extra"/>
-                <w:color w:val="000000"/>
-                <w:sz w:val="32"/>
-                <w:szCs w:val="40"/>
-              </w:rPr>
-            </w:pPr>
-            <w:r>
-              <w:rPr>
-                <w:rFonts w:cs="BRH Malayalam Extra"/>
-                <w:color w:val="000000"/>
-                <w:szCs w:val="40"/>
-              </w:rPr>
-              <w:lastRenderedPageBreak/>
+            <w:r>
+              <w:rPr>
+                <w:rFonts w:cs="BRH Malayalam Extra"/>
+                <w:color w:val="000000"/>
+                <w:szCs w:val="40"/>
+              </w:rPr>
               <w:t>23</w:t>
             </w:r>
             <w:r>
@@ -12881,7 +13053,6 @@
                 <w:color w:val="000000"/>
                 <w:szCs w:val="40"/>
               </w:rPr>
-              <w:lastRenderedPageBreak/>
               <w:t>47</w:t>
             </w:r>
             <w:r>
@@ -22473,6 +22644,7 @@
               </w:rPr>
               <w:t>m§</w:t>
             </w:r>
+            <w:proofErr w:type="gramStart"/>
             <w:r>
               <w:rPr>
                 <w:rFonts w:ascii="BRH Malayalam Extra" w:hAnsi="BRH Malayalam Extra" w:cs="BRH Malayalam Extra"/>
@@ -22501,6 +22673,7 @@
               </w:rPr>
               <w:t>p</w:t>
             </w:r>
+            <w:proofErr w:type="gramEnd"/>
             <w:r>
               <w:rPr>
                 <w:rFonts w:ascii="BRH Malayalam Extra" w:hAnsi="BRH Malayalam Extra" w:cs="BRH Malayalam Extra"/>
@@ -22618,8 +22791,20 @@
                 <w:szCs w:val="40"/>
                 <w:highlight w:val="yellow"/>
               </w:rPr>
-              <w:t>¤¤gm§.¥</w:t>
-            </w:r>
+              <w:t>¤¤gm</w:t>
+            </w:r>
+            <w:proofErr w:type="gramStart"/>
+            <w:r>
+              <w:rPr>
+                <w:rFonts w:ascii="BRH Malayalam Extra" w:hAnsi="BRH Malayalam Extra" w:cs="BRH Malayalam Extra"/>
+                <w:color w:val="000000"/>
+                <w:sz w:val="32"/>
+                <w:szCs w:val="40"/>
+                <w:highlight w:val="yellow"/>
+              </w:rPr>
+              <w:t>§.¥</w:t>
+            </w:r>
+            <w:proofErr w:type="gramEnd"/>
             <w:r>
               <w:rPr>
                 <w:rFonts w:ascii="BRH Malayalam Extra" w:hAnsi="BRH Malayalam Extra" w:cs="BRH Malayalam Extra"/>
@@ -22655,16 +22840,37 @@
                 <w:szCs w:val="40"/>
                 <w:highlight w:val="yellow"/>
               </w:rPr>
-              <w:t>¤¤gm§.</w:t>
-            </w:r>
-            <w:r>
-              <w:rPr>
-                <w:rFonts w:ascii="BRH Malayalam Extra" w:hAnsi="BRH Malayalam Extra" w:cs="BRH Malayalam Extra"/>
-                <w:color w:val="000000"/>
-                <w:sz w:val="32"/>
-                <w:szCs w:val="40"/>
-              </w:rPr>
-              <w:t xml:space="preserve">pJ | </w:t>
+              <w:t>¤¤gm</w:t>
+            </w:r>
+            <w:proofErr w:type="gramStart"/>
+            <w:r>
+              <w:rPr>
+                <w:rFonts w:ascii="BRH Malayalam Extra" w:hAnsi="BRH Malayalam Extra" w:cs="BRH Malayalam Extra"/>
+                <w:color w:val="000000"/>
+                <w:sz w:val="32"/>
+                <w:szCs w:val="40"/>
+                <w:highlight w:val="yellow"/>
+              </w:rPr>
+              <w:t>§.</w:t>
+            </w:r>
+            <w:r>
+              <w:rPr>
+                <w:rFonts w:ascii="BRH Malayalam Extra" w:hAnsi="BRH Malayalam Extra" w:cs="BRH Malayalam Extra"/>
+                <w:color w:val="000000"/>
+                <w:sz w:val="32"/>
+                <w:szCs w:val="40"/>
+              </w:rPr>
+              <w:t>pJ</w:t>
+            </w:r>
+            <w:proofErr w:type="gramEnd"/>
+            <w:r>
+              <w:rPr>
+                <w:rFonts w:ascii="BRH Malayalam Extra" w:hAnsi="BRH Malayalam Extra" w:cs="BRH Malayalam Extra"/>
+                <w:color w:val="000000"/>
+                <w:sz w:val="32"/>
+                <w:szCs w:val="40"/>
+              </w:rPr>
+              <w:t xml:space="preserve"> | </w:t>
             </w:r>
           </w:p>
           <w:p>
@@ -22875,6 +23081,7 @@
               </w:rPr>
               <w:t>m§</w:t>
             </w:r>
+            <w:proofErr w:type="gramStart"/>
             <w:r>
               <w:rPr>
                 <w:rFonts w:ascii="BRH Malayalam Extra" w:hAnsi="BRH Malayalam Extra" w:cs="BRH Malayalam Extra"/>
@@ -22903,6 +23110,7 @@
               </w:rPr>
               <w:t>p</w:t>
             </w:r>
+            <w:proofErr w:type="gramEnd"/>
             <w:r>
               <w:rPr>
                 <w:rFonts w:ascii="BRH Malayalam Extra" w:hAnsi="BRH Malayalam Extra" w:cs="BRH Malayalam Extra"/>
@@ -23076,7 +23284,29 @@
                 <w:szCs w:val="40"/>
                 <w:highlight w:val="yellow"/>
               </w:rPr>
-              <w:t>m§.¥px</w:t>
+              <w:t>m</w:t>
+            </w:r>
+            <w:proofErr w:type="gramStart"/>
+            <w:r>
+              <w:rPr>
+                <w:rFonts w:ascii="BRH Malayalam Extra" w:hAnsi="BRH Malayalam Extra" w:cs="BRH Malayalam Extra"/>
+                <w:color w:val="000000"/>
+                <w:sz w:val="32"/>
+                <w:szCs w:val="40"/>
+                <w:highlight w:val="yellow"/>
+              </w:rPr>
+              <w:t>§.¥</w:t>
+            </w:r>
+            <w:proofErr w:type="gramEnd"/>
+            <w:r>
+              <w:rPr>
+                <w:rFonts w:ascii="BRH Malayalam Extra" w:hAnsi="BRH Malayalam Extra" w:cs="BRH Malayalam Extra"/>
+                <w:color w:val="000000"/>
+                <w:sz w:val="32"/>
+                <w:szCs w:val="40"/>
+                <w:highlight w:val="yellow"/>
+              </w:rPr>
+              <w:t>px</w:t>
             </w:r>
             <w:r>
               <w:rPr>
@@ -23339,14 +23569,25 @@
               </w:rPr>
               <w:t>¤¤gm</w:t>
             </w:r>
-            <w:r>
-              <w:rPr>
-                <w:rFonts w:ascii="BRH Malayalam Extra" w:hAnsi="BRH Malayalam Extra" w:cs="BRH Malayalam Extra"/>
-                <w:color w:val="000000"/>
-                <w:sz w:val="32"/>
-                <w:szCs w:val="40"/>
-              </w:rPr>
-              <w:t xml:space="preserve">§.¥px </w:t>
+            <w:proofErr w:type="gramStart"/>
+            <w:r>
+              <w:rPr>
+                <w:rFonts w:ascii="BRH Malayalam Extra" w:hAnsi="BRH Malayalam Extra" w:cs="BRH Malayalam Extra"/>
+                <w:color w:val="000000"/>
+                <w:sz w:val="32"/>
+                <w:szCs w:val="40"/>
+              </w:rPr>
+              <w:t>§.¥</w:t>
+            </w:r>
+            <w:proofErr w:type="gramEnd"/>
+            <w:r>
+              <w:rPr>
+                <w:rFonts w:ascii="BRH Malayalam Extra" w:hAnsi="BRH Malayalam Extra" w:cs="BRH Malayalam Extra"/>
+                <w:color w:val="000000"/>
+                <w:sz w:val="32"/>
+                <w:szCs w:val="40"/>
+              </w:rPr>
+              <w:t xml:space="preserve">px </w:t>
             </w:r>
             <w:r>
               <w:rPr>
@@ -23375,7 +23616,29 @@
                 <w:szCs w:val="40"/>
                 <w:highlight w:val="yellow"/>
               </w:rPr>
-              <w:t>¤¤gm§.¥px</w:t>
+              <w:t>¤¤gm</w:t>
+            </w:r>
+            <w:proofErr w:type="gramStart"/>
+            <w:r>
+              <w:rPr>
+                <w:rFonts w:ascii="BRH Malayalam Extra" w:hAnsi="BRH Malayalam Extra" w:cs="BRH Malayalam Extra"/>
+                <w:color w:val="000000"/>
+                <w:sz w:val="32"/>
+                <w:szCs w:val="40"/>
+                <w:highlight w:val="yellow"/>
+              </w:rPr>
+              <w:t>§.¥</w:t>
+            </w:r>
+            <w:proofErr w:type="gramEnd"/>
+            <w:r>
+              <w:rPr>
+                <w:rFonts w:ascii="BRH Malayalam Extra" w:hAnsi="BRH Malayalam Extra" w:cs="BRH Malayalam Extra"/>
+                <w:color w:val="000000"/>
+                <w:sz w:val="32"/>
+                <w:szCs w:val="40"/>
+                <w:highlight w:val="yellow"/>
+              </w:rPr>
+              <w:t>px</w:t>
             </w:r>
             <w:r>
               <w:rPr>
@@ -23559,6 +23822,7 @@
               </w:rPr>
               <w:t>m§</w:t>
             </w:r>
+            <w:proofErr w:type="gramStart"/>
             <w:r>
               <w:rPr>
                 <w:rFonts w:ascii="BRH Malayalam Extra" w:hAnsi="BRH Malayalam Extra" w:cs="BRH Malayalam Extra"/>
@@ -23587,6 +23851,7 @@
               </w:rPr>
               <w:t>p</w:t>
             </w:r>
+            <w:proofErr w:type="gramEnd"/>
             <w:r>
               <w:rPr>
                 <w:rFonts w:ascii="BRH Malayalam Extra" w:hAnsi="BRH Malayalam Extra" w:cs="BRH Malayalam Extra"/>
@@ -23770,14 +24035,25 @@
               </w:rPr>
               <w:t>¤¤gm</w:t>
             </w:r>
-            <w:r>
-              <w:rPr>
-                <w:rFonts w:ascii="BRH Malayalam Extra" w:hAnsi="BRH Malayalam Extra" w:cs="BRH Malayalam Extra"/>
-                <w:color w:val="000000"/>
-                <w:sz w:val="32"/>
-                <w:szCs w:val="40"/>
-              </w:rPr>
-              <w:t xml:space="preserve">§.¥px </w:t>
+            <w:proofErr w:type="gramStart"/>
+            <w:r>
+              <w:rPr>
+                <w:rFonts w:ascii="BRH Malayalam Extra" w:hAnsi="BRH Malayalam Extra" w:cs="BRH Malayalam Extra"/>
+                <w:color w:val="000000"/>
+                <w:sz w:val="32"/>
+                <w:szCs w:val="40"/>
+              </w:rPr>
+              <w:t>§.¥</w:t>
+            </w:r>
+            <w:proofErr w:type="gramEnd"/>
+            <w:r>
+              <w:rPr>
+                <w:rFonts w:ascii="BRH Malayalam Extra" w:hAnsi="BRH Malayalam Extra" w:cs="BRH Malayalam Extra"/>
+                <w:color w:val="000000"/>
+                <w:sz w:val="32"/>
+                <w:szCs w:val="40"/>
+              </w:rPr>
+              <w:t xml:space="preserve">px </w:t>
             </w:r>
             <w:r>
               <w:rPr>
@@ -23787,7 +24063,29 @@
                 <w:szCs w:val="40"/>
                 <w:highlight w:val="yellow"/>
               </w:rPr>
-              <w:t>¤¤gm§.¥p</w:t>
+              <w:t>¤¤gm</w:t>
+            </w:r>
+            <w:proofErr w:type="gramStart"/>
+            <w:r>
+              <w:rPr>
+                <w:rFonts w:ascii="BRH Malayalam Extra" w:hAnsi="BRH Malayalam Extra" w:cs="BRH Malayalam Extra"/>
+                <w:color w:val="000000"/>
+                <w:sz w:val="32"/>
+                <w:szCs w:val="40"/>
+                <w:highlight w:val="yellow"/>
+              </w:rPr>
+              <w:t>§.¥</w:t>
+            </w:r>
+            <w:proofErr w:type="gramEnd"/>
+            <w:r>
+              <w:rPr>
+                <w:rFonts w:ascii="BRH Malayalam Extra" w:hAnsi="BRH Malayalam Extra" w:cs="BRH Malayalam Extra"/>
+                <w:color w:val="000000"/>
+                <w:sz w:val="32"/>
+                <w:szCs w:val="40"/>
+                <w:highlight w:val="yellow"/>
+              </w:rPr>
+              <w:t>p</w:t>
             </w:r>
             <w:r>
               <w:rPr>
@@ -23842,8 +24140,20 @@
                 <w:szCs w:val="40"/>
                 <w:highlight w:val="yellow"/>
               </w:rPr>
-              <w:t>¤¤gm§.¥</w:t>
-            </w:r>
+              <w:t>¤¤gm</w:t>
+            </w:r>
+            <w:proofErr w:type="gramStart"/>
+            <w:r>
+              <w:rPr>
+                <w:rFonts w:ascii="BRH Malayalam Extra" w:hAnsi="BRH Malayalam Extra" w:cs="BRH Malayalam Extra"/>
+                <w:color w:val="000000"/>
+                <w:sz w:val="32"/>
+                <w:szCs w:val="40"/>
+                <w:highlight w:val="yellow"/>
+              </w:rPr>
+              <w:t>§.¥</w:t>
+            </w:r>
+            <w:proofErr w:type="gramEnd"/>
             <w:r>
               <w:rPr>
                 <w:rFonts w:ascii="BRH Malayalam Extra" w:hAnsi="BRH Malayalam Extra" w:cs="BRH Malayalam Extra"/>
@@ -23861,7 +24171,29 @@
                 <w:szCs w:val="40"/>
                 <w:highlight w:val="yellow"/>
               </w:rPr>
-              <w:t>¤¤gm§.¥px</w:t>
+              <w:t>¤¤gm</w:t>
+            </w:r>
+            <w:proofErr w:type="gramStart"/>
+            <w:r>
+              <w:rPr>
+                <w:rFonts w:ascii="BRH Malayalam Extra" w:hAnsi="BRH Malayalam Extra" w:cs="BRH Malayalam Extra"/>
+                <w:color w:val="000000"/>
+                <w:sz w:val="32"/>
+                <w:szCs w:val="40"/>
+                <w:highlight w:val="yellow"/>
+              </w:rPr>
+              <w:t>§.¥</w:t>
+            </w:r>
+            <w:proofErr w:type="gramEnd"/>
+            <w:r>
+              <w:rPr>
+                <w:rFonts w:ascii="BRH Malayalam Extra" w:hAnsi="BRH Malayalam Extra" w:cs="BRH Malayalam Extra"/>
+                <w:color w:val="000000"/>
+                <w:sz w:val="32"/>
+                <w:szCs w:val="40"/>
+                <w:highlight w:val="yellow"/>
+              </w:rPr>
+              <w:t>px</w:t>
             </w:r>
             <w:r>
               <w:rPr>
@@ -24134,6 +24466,7 @@
               </w:rPr>
               <w:t>m§</w:t>
             </w:r>
+            <w:proofErr w:type="gramStart"/>
             <w:r>
               <w:rPr>
                 <w:rFonts w:ascii="BRH Malayalam Extra" w:hAnsi="BRH Malayalam Extra" w:cs="BRH Malayalam Extra"/>
@@ -24169,7 +24502,17 @@
                 <w:sz w:val="32"/>
                 <w:szCs w:val="40"/>
               </w:rPr>
-              <w:t>J |</w:t>
+              <w:t>J</w:t>
+            </w:r>
+            <w:proofErr w:type="gramEnd"/>
+            <w:r>
+              <w:rPr>
+                <w:rFonts w:ascii="BRH Malayalam Extra" w:hAnsi="BRH Malayalam Extra" w:cs="BRH Malayalam Extra"/>
+                <w:color w:val="000000"/>
+                <w:sz w:val="32"/>
+                <w:szCs w:val="40"/>
+              </w:rPr>
+              <w:t xml:space="preserve"> |</w:t>
             </w:r>
           </w:p>
           <w:p>
@@ -24423,6 +24766,7 @@
               </w:rPr>
               <w:t>m§</w:t>
             </w:r>
+            <w:proofErr w:type="gramStart"/>
             <w:r>
               <w:rPr>
                 <w:rFonts w:ascii="BRH Malayalam Extra" w:hAnsi="BRH Malayalam Extra" w:cs="BRH Malayalam Extra"/>
@@ -24450,7 +24794,17 @@
                 <w:sz w:val="32"/>
                 <w:szCs w:val="40"/>
               </w:rPr>
-              <w:t xml:space="preserve">pJ | </w:t>
+              <w:t>pJ</w:t>
+            </w:r>
+            <w:proofErr w:type="gramEnd"/>
+            <w:r>
+              <w:rPr>
+                <w:rFonts w:ascii="BRH Malayalam Extra" w:hAnsi="BRH Malayalam Extra" w:cs="BRH Malayalam Extra"/>
+                <w:color w:val="000000"/>
+                <w:sz w:val="32"/>
+                <w:szCs w:val="40"/>
+              </w:rPr>
+              <w:t xml:space="preserve"> | </w:t>
             </w:r>
           </w:p>
           <w:p>
@@ -24661,6 +25015,7 @@
               </w:rPr>
               <w:t>m§</w:t>
             </w:r>
+            <w:proofErr w:type="gramStart"/>
             <w:r>
               <w:rPr>
                 <w:rFonts w:ascii="BRH Malayalam Extra" w:hAnsi="BRH Malayalam Extra" w:cs="BRH Malayalam Extra"/>
@@ -24696,7 +25051,17 @@
                 <w:sz w:val="32"/>
                 <w:szCs w:val="40"/>
               </w:rPr>
-              <w:t>J | j¢e—J |</w:t>
+              <w:t>J</w:t>
+            </w:r>
+            <w:proofErr w:type="gramEnd"/>
+            <w:r>
+              <w:rPr>
+                <w:rFonts w:ascii="BRH Malayalam Extra" w:hAnsi="BRH Malayalam Extra" w:cs="BRH Malayalam Extra"/>
+                <w:color w:val="000000"/>
+                <w:sz w:val="32"/>
+                <w:szCs w:val="40"/>
+              </w:rPr>
+              <w:t xml:space="preserve"> | j¢e—J |</w:t>
             </w:r>
           </w:p>
           <w:p>
@@ -24866,6 +25231,7 @@
               </w:rPr>
               <w:t>–</w:t>
             </w:r>
+            <w:proofErr w:type="gramStart"/>
             <w:r>
               <w:rPr>
                 <w:rFonts w:ascii="BRH Malayalam Extra" w:hAnsi="BRH Malayalam Extra" w:cs="BRH Malayalam Extra"/>
@@ -24874,7 +25240,18 @@
                 <w:szCs w:val="40"/>
                 <w:highlight w:val="green"/>
               </w:rPr>
-              <w:t>§.¥px</w:t>
+              <w:t>§.¥</w:t>
+            </w:r>
+            <w:proofErr w:type="gramEnd"/>
+            <w:r>
+              <w:rPr>
+                <w:rFonts w:ascii="BRH Malayalam Extra" w:hAnsi="BRH Malayalam Extra" w:cs="BRH Malayalam Extra"/>
+                <w:color w:val="000000"/>
+                <w:sz w:val="32"/>
+                <w:szCs w:val="40"/>
+                <w:highlight w:val="green"/>
+              </w:rPr>
+              <w:t>px</w:t>
             </w:r>
             <w:r>
               <w:rPr>
@@ -25046,14 +25423,25 @@
               </w:rPr>
               <w:t>–</w:t>
             </w:r>
-            <w:r>
-              <w:rPr>
-                <w:rFonts w:ascii="BRH Malayalam Extra" w:hAnsi="BRH Malayalam Extra" w:cs="BRH Malayalam Extra"/>
-                <w:color w:val="000000"/>
-                <w:sz w:val="32"/>
-                <w:szCs w:val="40"/>
-              </w:rPr>
-              <w:t xml:space="preserve">§.¥px </w:t>
+            <w:proofErr w:type="gramStart"/>
+            <w:r>
+              <w:rPr>
+                <w:rFonts w:ascii="BRH Malayalam Extra" w:hAnsi="BRH Malayalam Extra" w:cs="BRH Malayalam Extra"/>
+                <w:color w:val="000000"/>
+                <w:sz w:val="32"/>
+                <w:szCs w:val="40"/>
+              </w:rPr>
+              <w:t>§.¥</w:t>
+            </w:r>
+            <w:proofErr w:type="gramEnd"/>
+            <w:r>
+              <w:rPr>
+                <w:rFonts w:ascii="BRH Malayalam Extra" w:hAnsi="BRH Malayalam Extra" w:cs="BRH Malayalam Extra"/>
+                <w:color w:val="000000"/>
+                <w:sz w:val="32"/>
+                <w:szCs w:val="40"/>
+              </w:rPr>
+              <w:t xml:space="preserve">px </w:t>
             </w:r>
             <w:r>
               <w:rPr>
@@ -25104,6 +25492,7 @@
               </w:rPr>
               <w:t>m§</w:t>
             </w:r>
+            <w:proofErr w:type="gramStart"/>
             <w:r>
               <w:rPr>
                 <w:rFonts w:ascii="BRH Malayalam Extra" w:hAnsi="BRH Malayalam Extra" w:cs="BRH Malayalam Extra"/>
@@ -25133,6 +25522,7 @@
               </w:rPr>
               <w:t>¥</w:t>
             </w:r>
+            <w:proofErr w:type="gramEnd"/>
             <w:r>
               <w:rPr>
                 <w:rFonts w:ascii="BRH Malayalam Extra" w:hAnsi="BRH Malayalam Extra" w:cs="BRH Malayalam Extra"/>
@@ -25316,6 +25706,7 @@
               </w:rPr>
               <w:t>m§</w:t>
             </w:r>
+            <w:proofErr w:type="gramStart"/>
             <w:r>
               <w:rPr>
                 <w:rFonts w:ascii="BRH Malayalam Extra" w:hAnsi="BRH Malayalam Extra" w:cs="BRH Malayalam Extra"/>
@@ -25351,7 +25742,17 @@
                 <w:sz w:val="32"/>
                 <w:szCs w:val="40"/>
               </w:rPr>
-              <w:t>J | j¢e—J | h</w:t>
+              <w:t>J</w:t>
+            </w:r>
+            <w:proofErr w:type="gramEnd"/>
+            <w:r>
+              <w:rPr>
+                <w:rFonts w:ascii="BRH Malayalam Extra" w:hAnsi="BRH Malayalam Extra" w:cs="BRH Malayalam Extra"/>
+                <w:color w:val="000000"/>
+                <w:sz w:val="32"/>
+                <w:szCs w:val="40"/>
+              </w:rPr>
+              <w:t xml:space="preserve"> | j¢e—J | h</w:t>
             </w:r>
             <w:r>
               <w:rPr>
@@ -25539,6 +25940,7 @@
               </w:rPr>
               <w:t>m§</w:t>
             </w:r>
+            <w:proofErr w:type="gramStart"/>
             <w:r>
               <w:rPr>
                 <w:rFonts w:ascii="BRH Malayalam Extra" w:hAnsi="BRH Malayalam Extra" w:cs="BRH Malayalam Extra"/>
@@ -25559,6 +25961,7 @@
               </w:rPr>
               <w:t>.¥</w:t>
             </w:r>
+            <w:proofErr w:type="gramEnd"/>
             <w:r>
               <w:rPr>
                 <w:rFonts w:ascii="BRH Malayalam Extra" w:hAnsi="BRH Malayalam Extra" w:cs="BRH Malayalam Extra"/>
@@ -25598,6 +26001,7 @@
               </w:rPr>
               <w:t>m§</w:t>
             </w:r>
+            <w:proofErr w:type="gramStart"/>
             <w:r>
               <w:rPr>
                 <w:rFonts w:ascii="BRH Malayalam Extra" w:hAnsi="BRH Malayalam Extra" w:cs="BRH Malayalam Extra"/>
@@ -25616,7 +26020,18 @@
                 <w:szCs w:val="40"/>
                 <w:highlight w:val="green"/>
               </w:rPr>
-              <w:t>.¥px</w:t>
+              <w:t>.¥</w:t>
+            </w:r>
+            <w:proofErr w:type="gramEnd"/>
+            <w:r>
+              <w:rPr>
+                <w:rFonts w:ascii="BRH Malayalam Extra" w:hAnsi="BRH Malayalam Extra" w:cs="BRH Malayalam Extra"/>
+                <w:color w:val="000000"/>
+                <w:sz w:val="32"/>
+                <w:szCs w:val="40"/>
+                <w:highlight w:val="green"/>
+              </w:rPr>
+              <w:t>px</w:t>
             </w:r>
             <w:r>
               <w:rPr>
@@ -25685,6 +26100,7 @@
               </w:rPr>
               <w:t>–</w:t>
             </w:r>
+            <w:proofErr w:type="gramStart"/>
             <w:r>
               <w:rPr>
                 <w:rFonts w:ascii="BRH Malayalam Extra" w:hAnsi="BRH Malayalam Extra" w:cs="BRH Malayalam Extra"/>
@@ -25702,7 +26118,17 @@
                 <w:sz w:val="32"/>
                 <w:szCs w:val="40"/>
               </w:rPr>
-              <w:t xml:space="preserve">¥px </w:t>
+              <w:t>¥</w:t>
+            </w:r>
+            <w:proofErr w:type="gramEnd"/>
+            <w:r>
+              <w:rPr>
+                <w:rFonts w:ascii="BRH Malayalam Extra" w:hAnsi="BRH Malayalam Extra" w:cs="BRH Malayalam Extra"/>
+                <w:color w:val="000000"/>
+                <w:sz w:val="32"/>
+                <w:szCs w:val="40"/>
+              </w:rPr>
+              <w:t xml:space="preserve">px </w:t>
             </w:r>
             <w:r>
               <w:rPr>
@@ -25743,6 +26169,7 @@
               </w:rPr>
               <w:t>–</w:t>
             </w:r>
+            <w:proofErr w:type="gramStart"/>
             <w:r>
               <w:rPr>
                 <w:rFonts w:ascii="BRH Malayalam Extra" w:hAnsi="BRH Malayalam Extra" w:cs="BRH Malayalam Extra"/>
@@ -25752,6 +26179,7 @@
               </w:rPr>
               <w:t>§.¥</w:t>
             </w:r>
+            <w:proofErr w:type="gramEnd"/>
             <w:r>
               <w:rPr>
                 <w:rFonts w:ascii="BRH Malayalam Extra" w:hAnsi="BRH Malayalam Extra" w:cs="BRH Malayalam Extra"/>
@@ -35878,27 +36306,7 @@
           <w:sz w:val="28"/>
           <w:szCs w:val="32"/>
         </w:rPr>
-        <w:t>(</w:t>
-      </w:r>
-      <w:proofErr w:type="gramStart"/>
-      <w:r>
-        <w:rPr>
-          <w:b/>
-          <w:bCs/>
-          <w:sz w:val="28"/>
-          <w:szCs w:val="32"/>
-        </w:rPr>
-        <w:t>ignore</w:t>
-      </w:r>
-      <w:proofErr w:type="gramEnd"/>
-      <w:r>
-        <w:rPr>
-          <w:b/>
-          <w:bCs/>
-          <w:sz w:val="28"/>
-          <w:szCs w:val="32"/>
-        </w:rPr>
-        <w:t xml:space="preserve"> those which are already incorporated in your book’s version and date)</w:t>
+        <w:t>(ignore those which are already incorporated in your book’s version and date)</w:t>
       </w:r>
     </w:p>
     <w:tbl>
@@ -36182,7 +36590,7 @@
 </file>
 
 <file path=word/endnotes.xml><?xml version="1.0" encoding="utf-8"?>
-<w:endnotes xmlns:wpc="http://schemas.microsoft.com/office/word/2010/wordprocessingCanvas" xmlns:cx="http://schemas.microsoft.com/office/drawing/2014/chartex" xmlns:cx1="http://schemas.microsoft.com/office/drawing/2015/9/8/chartex" xmlns:cx2="http://schemas.microsoft.com/office/drawing/2015/10/21/chartex" xmlns:cx3="http://schemas.microsoft.com/office/drawing/2016/5/9/chartex" xmlns:cx4="http://schemas.microsoft.com/office/drawing/2016/5/10/chartex" xmlns:cx5="http://schemas.microsoft.com/office/drawing/2016/5/11/chartex" xmlns:cx6="http://schemas.microsoft.com/office/drawing/2016/5/12/chartex" xmlns:cx7="http://schemas.microsoft.com/office/drawing/2016/5/13/chartex" xmlns:cx8="http://schemas.microsoft.com/office/drawing/2016/5/14/chartex" xmlns:mc="http://schemas.openxmlformats.org/markup-compatibility/2006" xmlns:aink="http://schemas.microsoft.com/office/drawing/2016/ink" xmlns:am3d="http://schemas.microsoft.com/office/drawing/2017/model3d" xmlns:o="urn:schemas-microsoft-com:office:office" xmlns:oel="http://schemas.microsoft.com/office/2019/extlst" xmlns:r="http://schemas.openxmlformats.org/officeDocument/2006/relationships" xmlns:m="http://schemas.openxmlformats.org/officeDocument/2006/math" xmlns:v="urn:schemas-microsoft-com:vml" xmlns:wp14="http://schemas.microsoft.com/office/word/2010/wordprocessingDrawing" xmlns:wp="http://schemas.openxmlformats.org/drawingml/2006/wordprocessingDrawing" xmlns:w10="urn:schemas-microsoft-com:office:word" xmlns:w="http://schemas.openxmlformats.org/wordprocessingml/2006/main" xmlns:w14="http://schemas.microsoft.com/office/word/2010/wordml" xmlns:w15="http://schemas.microsoft.com/office/word/2012/wordml" xmlns:w16cex="http://schemas.microsoft.com/office/word/2018/wordml/cex" xmlns:w16cid="http://schemas.microsoft.com/office/word/2016/wordml/cid" xmlns:w16="http://schemas.microsoft.com/office/word/2018/wordml" xmlns:w16du="http://schemas.microsoft.com/office/word/2023/wordml/word16du" xmlns:w16sdtdh="http://schemas.microsoft.com/office/word/2020/wordml/sdtdatahash" xmlns:w16se="http://schemas.microsoft.com/office/word/2015/wordml/symex" xmlns:wpg="http://schemas.microsoft.com/office/word/2010/wordprocessingGroup" xmlns:wpi="http://schemas.microsoft.com/office/word/2010/wordprocessingInk" xmlns:wne="http://schemas.microsoft.com/office/word/2006/wordml" xmlns:wps="http://schemas.microsoft.com/office/word/2010/wordprocessingShape" mc:Ignorable="w14 w15 w16se w16cid w16 w16cex w16sdtdh wp14">
+<w:endnotes xmlns:wpc="http://schemas.microsoft.com/office/word/2010/wordprocessingCanvas" xmlns:cx="http://schemas.microsoft.com/office/drawing/2014/chartex" xmlns:cx1="http://schemas.microsoft.com/office/drawing/2015/9/8/chartex" xmlns:cx2="http://schemas.microsoft.com/office/drawing/2015/10/21/chartex" xmlns:cx3="http://schemas.microsoft.com/office/drawing/2016/5/9/chartex" xmlns:cx4="http://schemas.microsoft.com/office/drawing/2016/5/10/chartex" xmlns:cx5="http://schemas.microsoft.com/office/drawing/2016/5/11/chartex" xmlns:cx6="http://schemas.microsoft.com/office/drawing/2016/5/12/chartex" xmlns:cx7="http://schemas.microsoft.com/office/drawing/2016/5/13/chartex" xmlns:cx8="http://schemas.microsoft.com/office/drawing/2016/5/14/chartex" xmlns:mc="http://schemas.openxmlformats.org/markup-compatibility/2006" xmlns:aink="http://schemas.microsoft.com/office/drawing/2016/ink" xmlns:am3d="http://schemas.microsoft.com/office/drawing/2017/model3d" xmlns:o="urn:schemas-microsoft-com:office:office" xmlns:oel="http://schemas.microsoft.com/office/2019/extlst" xmlns:r="http://schemas.openxmlformats.org/officeDocument/2006/relationships" xmlns:m="http://schemas.openxmlformats.org/officeDocument/2006/math" xmlns:v="urn:schemas-microsoft-com:vml" xmlns:wp14="http://schemas.microsoft.com/office/word/2010/wordprocessingDrawing" xmlns:wp="http://schemas.openxmlformats.org/drawingml/2006/wordprocessingDrawing" xmlns:w10="urn:schemas-microsoft-com:office:word" xmlns:w="http://schemas.openxmlformats.org/wordprocessingml/2006/main" xmlns:w14="http://schemas.microsoft.com/office/word/2010/wordml" xmlns:w15="http://schemas.microsoft.com/office/word/2012/wordml" xmlns:w16cex="http://schemas.microsoft.com/office/word/2018/wordml/cex" xmlns:w16cid="http://schemas.microsoft.com/office/word/2016/wordml/cid" xmlns:w16="http://schemas.microsoft.com/office/word/2018/wordml" xmlns:w16du="http://schemas.microsoft.com/office/word/2023/wordml/word16du" xmlns:w16sdtdh="http://schemas.microsoft.com/office/word/2020/wordml/sdtdatahash" xmlns:w16sdtfl="http://schemas.microsoft.com/office/word/2024/wordml/sdtformatlock" xmlns:w16se="http://schemas.microsoft.com/office/word/2015/wordml/symex" xmlns:wpg="http://schemas.microsoft.com/office/word/2010/wordprocessingGroup" xmlns:wpi="http://schemas.microsoft.com/office/word/2010/wordprocessingInk" xmlns:wne="http://schemas.microsoft.com/office/word/2006/wordml" xmlns:wps="http://schemas.microsoft.com/office/word/2010/wordprocessingShape" mc:Ignorable="w14 w15 w16se w16cid w16 w16cex w16sdtdh w16sdtfl w16du wp14">
   <w:endnote w:type="separator" w:id="-1">
     <w:p>
       <w:pPr>
@@ -36207,7 +36615,7 @@
 </file>
 
 <file path=word/footer1.xml><?xml version="1.0" encoding="utf-8"?>
-<w:ftr xmlns:wpc="http://schemas.microsoft.com/office/word/2010/wordprocessingCanvas" xmlns:cx="http://schemas.microsoft.com/office/drawing/2014/chartex" xmlns:cx1="http://schemas.microsoft.com/office/drawing/2015/9/8/chartex" xmlns:cx2="http://schemas.microsoft.com/office/drawing/2015/10/21/chartex" xmlns:cx3="http://schemas.microsoft.com/office/drawing/2016/5/9/chartex" xmlns:cx4="http://schemas.microsoft.com/office/drawing/2016/5/10/chartex" xmlns:cx5="http://schemas.microsoft.com/office/drawing/2016/5/11/chartex" xmlns:cx6="http://schemas.microsoft.com/office/drawing/2016/5/12/chartex" xmlns:cx7="http://schemas.microsoft.com/office/drawing/2016/5/13/chartex" xmlns:cx8="http://schemas.microsoft.com/office/drawing/2016/5/14/chartex" xmlns:mc="http://schemas.openxmlformats.org/markup-compatibility/2006" xmlns:aink="http://schemas.microsoft.com/office/drawing/2016/ink" xmlns:am3d="http://schemas.microsoft.com/office/drawing/2017/model3d" xmlns:o="urn:schemas-microsoft-com:office:office" xmlns:oel="http://schemas.microsoft.com/office/2019/extlst" xmlns:r="http://schemas.openxmlformats.org/officeDocument/2006/relationships" xmlns:m="http://schemas.openxmlformats.org/officeDocument/2006/math" xmlns:v="urn:schemas-microsoft-com:vml" xmlns:wp14="http://schemas.microsoft.com/office/word/2010/wordprocessingDrawing" xmlns:wp="http://schemas.openxmlformats.org/drawingml/2006/wordprocessingDrawing" xmlns:w10="urn:schemas-microsoft-com:office:word" xmlns:w="http://schemas.openxmlformats.org/wordprocessingml/2006/main" xmlns:w14="http://schemas.microsoft.com/office/word/2010/wordml" xmlns:w15="http://schemas.microsoft.com/office/word/2012/wordml" xmlns:w16cex="http://schemas.microsoft.com/office/word/2018/wordml/cex" xmlns:w16cid="http://schemas.microsoft.com/office/word/2016/wordml/cid" xmlns:w16="http://schemas.microsoft.com/office/word/2018/wordml" xmlns:w16du="http://schemas.microsoft.com/office/word/2023/wordml/word16du" xmlns:w16sdtdh="http://schemas.microsoft.com/office/word/2020/wordml/sdtdatahash" xmlns:w16se="http://schemas.microsoft.com/office/word/2015/wordml/symex" xmlns:wpg="http://schemas.microsoft.com/office/word/2010/wordprocessingGroup" xmlns:wpi="http://schemas.microsoft.com/office/word/2010/wordprocessingInk" xmlns:wne="http://schemas.microsoft.com/office/word/2006/wordml" xmlns:wps="http://schemas.microsoft.com/office/word/2010/wordprocessingShape" mc:Ignorable="w14 w15 w16se w16cid w16 w16cex w16sdtdh wp14">
+<w:ftr xmlns:wpc="http://schemas.microsoft.com/office/word/2010/wordprocessingCanvas" xmlns:cx="http://schemas.microsoft.com/office/drawing/2014/chartex" xmlns:cx1="http://schemas.microsoft.com/office/drawing/2015/9/8/chartex" xmlns:cx2="http://schemas.microsoft.com/office/drawing/2015/10/21/chartex" xmlns:cx3="http://schemas.microsoft.com/office/drawing/2016/5/9/chartex" xmlns:cx4="http://schemas.microsoft.com/office/drawing/2016/5/10/chartex" xmlns:cx5="http://schemas.microsoft.com/office/drawing/2016/5/11/chartex" xmlns:cx6="http://schemas.microsoft.com/office/drawing/2016/5/12/chartex" xmlns:cx7="http://schemas.microsoft.com/office/drawing/2016/5/13/chartex" xmlns:cx8="http://schemas.microsoft.com/office/drawing/2016/5/14/chartex" xmlns:mc="http://schemas.openxmlformats.org/markup-compatibility/2006" xmlns:aink="http://schemas.microsoft.com/office/drawing/2016/ink" xmlns:am3d="http://schemas.microsoft.com/office/drawing/2017/model3d" xmlns:o="urn:schemas-microsoft-com:office:office" xmlns:oel="http://schemas.microsoft.com/office/2019/extlst" xmlns:r="http://schemas.openxmlformats.org/officeDocument/2006/relationships" xmlns:m="http://schemas.openxmlformats.org/officeDocument/2006/math" xmlns:v="urn:schemas-microsoft-com:vml" xmlns:wp14="http://schemas.microsoft.com/office/word/2010/wordprocessingDrawing" xmlns:wp="http://schemas.openxmlformats.org/drawingml/2006/wordprocessingDrawing" xmlns:w10="urn:schemas-microsoft-com:office:word" xmlns:w="http://schemas.openxmlformats.org/wordprocessingml/2006/main" xmlns:w14="http://schemas.microsoft.com/office/word/2010/wordml" xmlns:w15="http://schemas.microsoft.com/office/word/2012/wordml" xmlns:w16cex="http://schemas.microsoft.com/office/word/2018/wordml/cex" xmlns:w16cid="http://schemas.microsoft.com/office/word/2016/wordml/cid" xmlns:w16="http://schemas.microsoft.com/office/word/2018/wordml" xmlns:w16du="http://schemas.microsoft.com/office/word/2023/wordml/word16du" xmlns:w16sdtdh="http://schemas.microsoft.com/office/word/2020/wordml/sdtdatahash" xmlns:w16sdtfl="http://schemas.microsoft.com/office/word/2024/wordml/sdtformatlock" xmlns:w16se="http://schemas.microsoft.com/office/word/2015/wordml/symex" xmlns:wpg="http://schemas.microsoft.com/office/word/2010/wordprocessingGroup" xmlns:wpi="http://schemas.microsoft.com/office/word/2010/wordprocessingInk" xmlns:wne="http://schemas.microsoft.com/office/word/2006/wordml" xmlns:wps="http://schemas.microsoft.com/office/word/2010/wordprocessingShape" mc:Ignorable="w14 w15 w16se w16cid w16 w16cex w16sdtdh w16sdtfl w16du wp14">
   <w:p>
     <w:pPr>
       <w:pBdr>
@@ -36389,7 +36797,7 @@
 </file>
 
 <file path=word/footer2.xml><?xml version="1.0" encoding="utf-8"?>
-<w:ftr xmlns:wpc="http://schemas.microsoft.com/office/word/2010/wordprocessingCanvas" xmlns:cx="http://schemas.microsoft.com/office/drawing/2014/chartex" xmlns:cx1="http://schemas.microsoft.com/office/drawing/2015/9/8/chartex" xmlns:cx2="http://schemas.microsoft.com/office/drawing/2015/10/21/chartex" xmlns:cx3="http://schemas.microsoft.com/office/drawing/2016/5/9/chartex" xmlns:cx4="http://schemas.microsoft.com/office/drawing/2016/5/10/chartex" xmlns:cx5="http://schemas.microsoft.com/office/drawing/2016/5/11/chartex" xmlns:cx6="http://schemas.microsoft.com/office/drawing/2016/5/12/chartex" xmlns:cx7="http://schemas.microsoft.com/office/drawing/2016/5/13/chartex" xmlns:cx8="http://schemas.microsoft.com/office/drawing/2016/5/14/chartex" xmlns:mc="http://schemas.openxmlformats.org/markup-compatibility/2006" xmlns:aink="http://schemas.microsoft.com/office/drawing/2016/ink" xmlns:am3d="http://schemas.microsoft.com/office/drawing/2017/model3d" xmlns:o="urn:schemas-microsoft-com:office:office" xmlns:oel="http://schemas.microsoft.com/office/2019/extlst" xmlns:r="http://schemas.openxmlformats.org/officeDocument/2006/relationships" xmlns:m="http://schemas.openxmlformats.org/officeDocument/2006/math" xmlns:v="urn:schemas-microsoft-com:vml" xmlns:wp14="http://schemas.microsoft.com/office/word/2010/wordprocessingDrawing" xmlns:wp="http://schemas.openxmlformats.org/drawingml/2006/wordprocessingDrawing" xmlns:w10="urn:schemas-microsoft-com:office:word" xmlns:w="http://schemas.openxmlformats.org/wordprocessingml/2006/main" xmlns:w14="http://schemas.microsoft.com/office/word/2010/wordml" xmlns:w15="http://schemas.microsoft.com/office/word/2012/wordml" xmlns:w16cex="http://schemas.microsoft.com/office/word/2018/wordml/cex" xmlns:w16cid="http://schemas.microsoft.com/office/word/2016/wordml/cid" xmlns:w16="http://schemas.microsoft.com/office/word/2018/wordml" xmlns:w16du="http://schemas.microsoft.com/office/word/2023/wordml/word16du" xmlns:w16sdtdh="http://schemas.microsoft.com/office/word/2020/wordml/sdtdatahash" xmlns:w16se="http://schemas.microsoft.com/office/word/2015/wordml/symex" xmlns:wpg="http://schemas.microsoft.com/office/word/2010/wordprocessingGroup" xmlns:wpi="http://schemas.microsoft.com/office/word/2010/wordprocessingInk" xmlns:wne="http://schemas.microsoft.com/office/word/2006/wordml" xmlns:wps="http://schemas.microsoft.com/office/word/2010/wordprocessingShape" mc:Ignorable="w14 w15 w16se w16cid w16 w16cex w16sdtdh wp14">
+<w:ftr xmlns:wpc="http://schemas.microsoft.com/office/word/2010/wordprocessingCanvas" xmlns:cx="http://schemas.microsoft.com/office/drawing/2014/chartex" xmlns:cx1="http://schemas.microsoft.com/office/drawing/2015/9/8/chartex" xmlns:cx2="http://schemas.microsoft.com/office/drawing/2015/10/21/chartex" xmlns:cx3="http://schemas.microsoft.com/office/drawing/2016/5/9/chartex" xmlns:cx4="http://schemas.microsoft.com/office/drawing/2016/5/10/chartex" xmlns:cx5="http://schemas.microsoft.com/office/drawing/2016/5/11/chartex" xmlns:cx6="http://schemas.microsoft.com/office/drawing/2016/5/12/chartex" xmlns:cx7="http://schemas.microsoft.com/office/drawing/2016/5/13/chartex" xmlns:cx8="http://schemas.microsoft.com/office/drawing/2016/5/14/chartex" xmlns:mc="http://schemas.openxmlformats.org/markup-compatibility/2006" xmlns:aink="http://schemas.microsoft.com/office/drawing/2016/ink" xmlns:am3d="http://schemas.microsoft.com/office/drawing/2017/model3d" xmlns:o="urn:schemas-microsoft-com:office:office" xmlns:oel="http://schemas.microsoft.com/office/2019/extlst" xmlns:r="http://schemas.openxmlformats.org/officeDocument/2006/relationships" xmlns:m="http://schemas.openxmlformats.org/officeDocument/2006/math" xmlns:v="urn:schemas-microsoft-com:vml" xmlns:wp14="http://schemas.microsoft.com/office/word/2010/wordprocessingDrawing" xmlns:wp="http://schemas.openxmlformats.org/drawingml/2006/wordprocessingDrawing" xmlns:w10="urn:schemas-microsoft-com:office:word" xmlns:w="http://schemas.openxmlformats.org/wordprocessingml/2006/main" xmlns:w14="http://schemas.microsoft.com/office/word/2010/wordml" xmlns:w15="http://schemas.microsoft.com/office/word/2012/wordml" xmlns:w16cex="http://schemas.microsoft.com/office/word/2018/wordml/cex" xmlns:w16cid="http://schemas.microsoft.com/office/word/2016/wordml/cid" xmlns:w16="http://schemas.microsoft.com/office/word/2018/wordml" xmlns:w16du="http://schemas.microsoft.com/office/word/2023/wordml/word16du" xmlns:w16sdtdh="http://schemas.microsoft.com/office/word/2020/wordml/sdtdatahash" xmlns:w16sdtfl="http://schemas.microsoft.com/office/word/2024/wordml/sdtformatlock" xmlns:w16se="http://schemas.microsoft.com/office/word/2015/wordml/symex" xmlns:wpg="http://schemas.microsoft.com/office/word/2010/wordprocessingGroup" xmlns:wpi="http://schemas.microsoft.com/office/word/2010/wordprocessingInk" xmlns:wne="http://schemas.microsoft.com/office/word/2006/wordml" xmlns:wps="http://schemas.microsoft.com/office/word/2010/wordprocessingShape" mc:Ignorable="w14 w15 w16se w16cid w16 w16cex w16sdtdh w16sdtfl w16du wp14">
   <w:p>
     <w:pPr>
       <w:pBdr>
@@ -36595,7 +37003,7 @@
 </file>
 
 <file path=word/footnotes.xml><?xml version="1.0" encoding="utf-8"?>
-<w:footnotes xmlns:wpc="http://schemas.microsoft.com/office/word/2010/wordprocessingCanvas" xmlns:cx="http://schemas.microsoft.com/office/drawing/2014/chartex" xmlns:cx1="http://schemas.microsoft.com/office/drawing/2015/9/8/chartex" xmlns:cx2="http://schemas.microsoft.com/office/drawing/2015/10/21/chartex" xmlns:cx3="http://schemas.microsoft.com/office/drawing/2016/5/9/chartex" xmlns:cx4="http://schemas.microsoft.com/office/drawing/2016/5/10/chartex" xmlns:cx5="http://schemas.microsoft.com/office/drawing/2016/5/11/chartex" xmlns:cx6="http://schemas.microsoft.com/office/drawing/2016/5/12/chartex" xmlns:cx7="http://schemas.microsoft.com/office/drawing/2016/5/13/chartex" xmlns:cx8="http://schemas.microsoft.com/office/drawing/2016/5/14/chartex" xmlns:mc="http://schemas.openxmlformats.org/markup-compatibility/2006" xmlns:aink="http://schemas.microsoft.com/office/drawing/2016/ink" xmlns:am3d="http://schemas.microsoft.com/office/drawing/2017/model3d" xmlns:o="urn:schemas-microsoft-com:office:office" xmlns:oel="http://schemas.microsoft.com/office/2019/extlst" xmlns:r="http://schemas.openxmlformats.org/officeDocument/2006/relationships" xmlns:m="http://schemas.openxmlformats.org/officeDocument/2006/math" xmlns:v="urn:schemas-microsoft-com:vml" xmlns:wp14="http://schemas.microsoft.com/office/word/2010/wordprocessingDrawing" xmlns:wp="http://schemas.openxmlformats.org/drawingml/2006/wordprocessingDrawing" xmlns:w10="urn:schemas-microsoft-com:office:word" xmlns:w="http://schemas.openxmlformats.org/wordprocessingml/2006/main" xmlns:w14="http://schemas.microsoft.com/office/word/2010/wordml" xmlns:w15="http://schemas.microsoft.com/office/word/2012/wordml" xmlns:w16cex="http://schemas.microsoft.com/office/word/2018/wordml/cex" xmlns:w16cid="http://schemas.microsoft.com/office/word/2016/wordml/cid" xmlns:w16="http://schemas.microsoft.com/office/word/2018/wordml" xmlns:w16du="http://schemas.microsoft.com/office/word/2023/wordml/word16du" xmlns:w16sdtdh="http://schemas.microsoft.com/office/word/2020/wordml/sdtdatahash" xmlns:w16se="http://schemas.microsoft.com/office/word/2015/wordml/symex" xmlns:wpg="http://schemas.microsoft.com/office/word/2010/wordprocessingGroup" xmlns:wpi="http://schemas.microsoft.com/office/word/2010/wordprocessingInk" xmlns:wne="http://schemas.microsoft.com/office/word/2006/wordml" xmlns:wps="http://schemas.microsoft.com/office/word/2010/wordprocessingShape" mc:Ignorable="w14 w15 w16se w16cid w16 w16cex w16sdtdh wp14">
+<w:footnotes xmlns:wpc="http://schemas.microsoft.com/office/word/2010/wordprocessingCanvas" xmlns:cx="http://schemas.microsoft.com/office/drawing/2014/chartex" xmlns:cx1="http://schemas.microsoft.com/office/drawing/2015/9/8/chartex" xmlns:cx2="http://schemas.microsoft.com/office/drawing/2015/10/21/chartex" xmlns:cx3="http://schemas.microsoft.com/office/drawing/2016/5/9/chartex" xmlns:cx4="http://schemas.microsoft.com/office/drawing/2016/5/10/chartex" xmlns:cx5="http://schemas.microsoft.com/office/drawing/2016/5/11/chartex" xmlns:cx6="http://schemas.microsoft.com/office/drawing/2016/5/12/chartex" xmlns:cx7="http://schemas.microsoft.com/office/drawing/2016/5/13/chartex" xmlns:cx8="http://schemas.microsoft.com/office/drawing/2016/5/14/chartex" xmlns:mc="http://schemas.openxmlformats.org/markup-compatibility/2006" xmlns:aink="http://schemas.microsoft.com/office/drawing/2016/ink" xmlns:am3d="http://schemas.microsoft.com/office/drawing/2017/model3d" xmlns:o="urn:schemas-microsoft-com:office:office" xmlns:oel="http://schemas.microsoft.com/office/2019/extlst" xmlns:r="http://schemas.openxmlformats.org/officeDocument/2006/relationships" xmlns:m="http://schemas.openxmlformats.org/officeDocument/2006/math" xmlns:v="urn:schemas-microsoft-com:vml" xmlns:wp14="http://schemas.microsoft.com/office/word/2010/wordprocessingDrawing" xmlns:wp="http://schemas.openxmlformats.org/drawingml/2006/wordprocessingDrawing" xmlns:w10="urn:schemas-microsoft-com:office:word" xmlns:w="http://schemas.openxmlformats.org/wordprocessingml/2006/main" xmlns:w14="http://schemas.microsoft.com/office/word/2010/wordml" xmlns:w15="http://schemas.microsoft.com/office/word/2012/wordml" xmlns:w16cex="http://schemas.microsoft.com/office/word/2018/wordml/cex" xmlns:w16cid="http://schemas.microsoft.com/office/word/2016/wordml/cid" xmlns:w16="http://schemas.microsoft.com/office/word/2018/wordml" xmlns:w16du="http://schemas.microsoft.com/office/word/2023/wordml/word16du" xmlns:w16sdtdh="http://schemas.microsoft.com/office/word/2020/wordml/sdtdatahash" xmlns:w16sdtfl="http://schemas.microsoft.com/office/word/2024/wordml/sdtformatlock" xmlns:w16se="http://schemas.microsoft.com/office/word/2015/wordml/symex" xmlns:wpg="http://schemas.microsoft.com/office/word/2010/wordprocessingGroup" xmlns:wpi="http://schemas.microsoft.com/office/word/2010/wordprocessingInk" xmlns:wne="http://schemas.microsoft.com/office/word/2006/wordml" xmlns:wps="http://schemas.microsoft.com/office/word/2010/wordprocessingShape" mc:Ignorable="w14 w15 w16se w16cid w16 w16cex w16sdtdh w16sdtfl w16du wp14">
   <w:footnote w:type="separator" w:id="-1">
     <w:p>
       <w:pPr>
@@ -36620,7 +37028,7 @@
 </file>
 
 <file path=word/header1.xml><?xml version="1.0" encoding="utf-8"?>
-<w:hdr xmlns:wpc="http://schemas.microsoft.com/office/word/2010/wordprocessingCanvas" xmlns:cx="http://schemas.microsoft.com/office/drawing/2014/chartex" xmlns:cx1="http://schemas.microsoft.com/office/drawing/2015/9/8/chartex" xmlns:cx2="http://schemas.microsoft.com/office/drawing/2015/10/21/chartex" xmlns:cx3="http://schemas.microsoft.com/office/drawing/2016/5/9/chartex" xmlns:cx4="http://schemas.microsoft.com/office/drawing/2016/5/10/chartex" xmlns:cx5="http://schemas.microsoft.com/office/drawing/2016/5/11/chartex" xmlns:cx6="http://schemas.microsoft.com/office/drawing/2016/5/12/chartex" xmlns:cx7="http://schemas.microsoft.com/office/drawing/2016/5/13/chartex" xmlns:cx8="http://schemas.microsoft.com/office/drawing/2016/5/14/chartex" xmlns:mc="http://schemas.openxmlformats.org/markup-compatibility/2006" xmlns:aink="http://schemas.microsoft.com/office/drawing/2016/ink" xmlns:am3d="http://schemas.microsoft.com/office/drawing/2017/model3d" xmlns:o="urn:schemas-microsoft-com:office:office" xmlns:oel="http://schemas.microsoft.com/office/2019/extlst" xmlns:r="http://schemas.openxmlformats.org/officeDocument/2006/relationships" xmlns:m="http://schemas.openxmlformats.org/officeDocument/2006/math" xmlns:v="urn:schemas-microsoft-com:vml" xmlns:wp14="http://schemas.microsoft.com/office/word/2010/wordprocessingDrawing" xmlns:wp="http://schemas.openxmlformats.org/drawingml/2006/wordprocessingDrawing" xmlns:w10="urn:schemas-microsoft-com:office:word" xmlns:w="http://schemas.openxmlformats.org/wordprocessingml/2006/main" xmlns:w14="http://schemas.microsoft.com/office/word/2010/wordml" xmlns:w15="http://schemas.microsoft.com/office/word/2012/wordml" xmlns:w16cex="http://schemas.microsoft.com/office/word/2018/wordml/cex" xmlns:w16cid="http://schemas.microsoft.com/office/word/2016/wordml/cid" xmlns:w16="http://schemas.microsoft.com/office/word/2018/wordml" xmlns:w16du="http://schemas.microsoft.com/office/word/2023/wordml/word16du" xmlns:w16sdtdh="http://schemas.microsoft.com/office/word/2020/wordml/sdtdatahash" xmlns:w16se="http://schemas.microsoft.com/office/word/2015/wordml/symex" xmlns:wpg="http://schemas.microsoft.com/office/word/2010/wordprocessingGroup" xmlns:wpi="http://schemas.microsoft.com/office/word/2010/wordprocessingInk" xmlns:wne="http://schemas.microsoft.com/office/word/2006/wordml" xmlns:wps="http://schemas.microsoft.com/office/word/2010/wordprocessingShape" mc:Ignorable="w14 w15 w16se w16cid w16 w16cex w16sdtdh wp14">
+<w:hdr xmlns:wpc="http://schemas.microsoft.com/office/word/2010/wordprocessingCanvas" xmlns:cx="http://schemas.microsoft.com/office/drawing/2014/chartex" xmlns:cx1="http://schemas.microsoft.com/office/drawing/2015/9/8/chartex" xmlns:cx2="http://schemas.microsoft.com/office/drawing/2015/10/21/chartex" xmlns:cx3="http://schemas.microsoft.com/office/drawing/2016/5/9/chartex" xmlns:cx4="http://schemas.microsoft.com/office/drawing/2016/5/10/chartex" xmlns:cx5="http://schemas.microsoft.com/office/drawing/2016/5/11/chartex" xmlns:cx6="http://schemas.microsoft.com/office/drawing/2016/5/12/chartex" xmlns:cx7="http://schemas.microsoft.com/office/drawing/2016/5/13/chartex" xmlns:cx8="http://schemas.microsoft.com/office/drawing/2016/5/14/chartex" xmlns:mc="http://schemas.openxmlformats.org/markup-compatibility/2006" xmlns:aink="http://schemas.microsoft.com/office/drawing/2016/ink" xmlns:am3d="http://schemas.microsoft.com/office/drawing/2017/model3d" xmlns:o="urn:schemas-microsoft-com:office:office" xmlns:oel="http://schemas.microsoft.com/office/2019/extlst" xmlns:r="http://schemas.openxmlformats.org/officeDocument/2006/relationships" xmlns:m="http://schemas.openxmlformats.org/officeDocument/2006/math" xmlns:v="urn:schemas-microsoft-com:vml" xmlns:wp14="http://schemas.microsoft.com/office/word/2010/wordprocessingDrawing" xmlns:wp="http://schemas.openxmlformats.org/drawingml/2006/wordprocessingDrawing" xmlns:w10="urn:schemas-microsoft-com:office:word" xmlns:w="http://schemas.openxmlformats.org/wordprocessingml/2006/main" xmlns:w14="http://schemas.microsoft.com/office/word/2010/wordml" xmlns:w15="http://schemas.microsoft.com/office/word/2012/wordml" xmlns:w16cex="http://schemas.microsoft.com/office/word/2018/wordml/cex" xmlns:w16cid="http://schemas.microsoft.com/office/word/2016/wordml/cid" xmlns:w16="http://schemas.microsoft.com/office/word/2018/wordml" xmlns:w16du="http://schemas.microsoft.com/office/word/2023/wordml/word16du" xmlns:w16sdtdh="http://schemas.microsoft.com/office/word/2020/wordml/sdtdatahash" xmlns:w16sdtfl="http://schemas.microsoft.com/office/word/2024/wordml/sdtformatlock" xmlns:w16se="http://schemas.microsoft.com/office/word/2015/wordml/symex" xmlns:wpg="http://schemas.microsoft.com/office/word/2010/wordprocessingGroup" xmlns:wpi="http://schemas.microsoft.com/office/word/2010/wordprocessingInk" xmlns:wne="http://schemas.microsoft.com/office/word/2006/wordml" xmlns:wps="http://schemas.microsoft.com/office/word/2010/wordprocessingShape" mc:Ignorable="w14 w15 w16se w16cid w16 w16cex w16sdtdh w16sdtfl w16du wp14">
   <w:p>
     <w:pPr>
       <w:pStyle w:val="Header"/>
@@ -36641,7 +37049,7 @@
 </file>
 
 <file path=word/header2.xml><?xml version="1.0" encoding="utf-8"?>
-<w:hdr xmlns:wpc="http://schemas.microsoft.com/office/word/2010/wordprocessingCanvas" xmlns:cx="http://schemas.microsoft.com/office/drawing/2014/chartex" xmlns:cx1="http://schemas.microsoft.com/office/drawing/2015/9/8/chartex" xmlns:cx2="http://schemas.microsoft.com/office/drawing/2015/10/21/chartex" xmlns:cx3="http://schemas.microsoft.com/office/drawing/2016/5/9/chartex" xmlns:cx4="http://schemas.microsoft.com/office/drawing/2016/5/10/chartex" xmlns:cx5="http://schemas.microsoft.com/office/drawing/2016/5/11/chartex" xmlns:cx6="http://schemas.microsoft.com/office/drawing/2016/5/12/chartex" xmlns:cx7="http://schemas.microsoft.com/office/drawing/2016/5/13/chartex" xmlns:cx8="http://schemas.microsoft.com/office/drawing/2016/5/14/chartex" xmlns:mc="http://schemas.openxmlformats.org/markup-compatibility/2006" xmlns:aink="http://schemas.microsoft.com/office/drawing/2016/ink" xmlns:am3d="http://schemas.microsoft.com/office/drawing/2017/model3d" xmlns:o="urn:schemas-microsoft-com:office:office" xmlns:oel="http://schemas.microsoft.com/office/2019/extlst" xmlns:r="http://schemas.openxmlformats.org/officeDocument/2006/relationships" xmlns:m="http://schemas.openxmlformats.org/officeDocument/2006/math" xmlns:v="urn:schemas-microsoft-com:vml" xmlns:wp14="http://schemas.microsoft.com/office/word/2010/wordprocessingDrawing" xmlns:wp="http://schemas.openxmlformats.org/drawingml/2006/wordprocessingDrawing" xmlns:w10="urn:schemas-microsoft-com:office:word" xmlns:w="http://schemas.openxmlformats.org/wordprocessingml/2006/main" xmlns:w14="http://schemas.microsoft.com/office/word/2010/wordml" xmlns:w15="http://schemas.microsoft.com/office/word/2012/wordml" xmlns:w16cex="http://schemas.microsoft.com/office/word/2018/wordml/cex" xmlns:w16cid="http://schemas.microsoft.com/office/word/2016/wordml/cid" xmlns:w16="http://schemas.microsoft.com/office/word/2018/wordml" xmlns:w16du="http://schemas.microsoft.com/office/word/2023/wordml/word16du" xmlns:w16sdtdh="http://schemas.microsoft.com/office/word/2020/wordml/sdtdatahash" xmlns:w16se="http://schemas.microsoft.com/office/word/2015/wordml/symex" xmlns:wpg="http://schemas.microsoft.com/office/word/2010/wordprocessingGroup" xmlns:wpi="http://schemas.microsoft.com/office/word/2010/wordprocessingInk" xmlns:wne="http://schemas.microsoft.com/office/word/2006/wordml" xmlns:wps="http://schemas.microsoft.com/office/word/2010/wordprocessingShape" mc:Ignorable="w14 w15 w16se w16cid w16 w16cex w16sdtdh wp14">
+<w:hdr xmlns:wpc="http://schemas.microsoft.com/office/word/2010/wordprocessingCanvas" xmlns:cx="http://schemas.microsoft.com/office/drawing/2014/chartex" xmlns:cx1="http://schemas.microsoft.com/office/drawing/2015/9/8/chartex" xmlns:cx2="http://schemas.microsoft.com/office/drawing/2015/10/21/chartex" xmlns:cx3="http://schemas.microsoft.com/office/drawing/2016/5/9/chartex" xmlns:cx4="http://schemas.microsoft.com/office/drawing/2016/5/10/chartex" xmlns:cx5="http://schemas.microsoft.com/office/drawing/2016/5/11/chartex" xmlns:cx6="http://schemas.microsoft.com/office/drawing/2016/5/12/chartex" xmlns:cx7="http://schemas.microsoft.com/office/drawing/2016/5/13/chartex" xmlns:cx8="http://schemas.microsoft.com/office/drawing/2016/5/14/chartex" xmlns:mc="http://schemas.openxmlformats.org/markup-compatibility/2006" xmlns:aink="http://schemas.microsoft.com/office/drawing/2016/ink" xmlns:am3d="http://schemas.microsoft.com/office/drawing/2017/model3d" xmlns:o="urn:schemas-microsoft-com:office:office" xmlns:oel="http://schemas.microsoft.com/office/2019/extlst" xmlns:r="http://schemas.openxmlformats.org/officeDocument/2006/relationships" xmlns:m="http://schemas.openxmlformats.org/officeDocument/2006/math" xmlns:v="urn:schemas-microsoft-com:vml" xmlns:wp14="http://schemas.microsoft.com/office/word/2010/wordprocessingDrawing" xmlns:wp="http://schemas.openxmlformats.org/drawingml/2006/wordprocessingDrawing" xmlns:w10="urn:schemas-microsoft-com:office:word" xmlns:w="http://schemas.openxmlformats.org/wordprocessingml/2006/main" xmlns:w14="http://schemas.microsoft.com/office/word/2010/wordml" xmlns:w15="http://schemas.microsoft.com/office/word/2012/wordml" xmlns:w16cex="http://schemas.microsoft.com/office/word/2018/wordml/cex" xmlns:w16cid="http://schemas.microsoft.com/office/word/2016/wordml/cid" xmlns:w16="http://schemas.microsoft.com/office/word/2018/wordml" xmlns:w16du="http://schemas.microsoft.com/office/word/2023/wordml/word16du" xmlns:w16sdtdh="http://schemas.microsoft.com/office/word/2020/wordml/sdtdatahash" xmlns:w16sdtfl="http://schemas.microsoft.com/office/word/2024/wordml/sdtformatlock" xmlns:w16se="http://schemas.microsoft.com/office/word/2015/wordml/symex" xmlns:wpg="http://schemas.microsoft.com/office/word/2010/wordprocessingGroup" xmlns:wpi="http://schemas.microsoft.com/office/word/2010/wordprocessingInk" xmlns:wne="http://schemas.microsoft.com/office/word/2006/wordml" xmlns:wps="http://schemas.microsoft.com/office/word/2010/wordprocessingShape" mc:Ignorable="w14 w15 w16se w16cid w16 w16cex w16sdtdh w16sdtfl w16du wp14">
   <w:p>
     <w:pPr>
       <w:pStyle w:val="Header"/>
@@ -36654,7 +37062,7 @@
 </file>
 
 <file path=word/styles.xml><?xml version="1.0" encoding="utf-8"?>
-<w:styles xmlns:mc="http://schemas.openxmlformats.org/markup-compatibility/2006" xmlns:r="http://schemas.openxmlformats.org/officeDocument/2006/relationships" xmlns:w="http://schemas.openxmlformats.org/wordprocessingml/2006/main" xmlns:w14="http://schemas.microsoft.com/office/word/2010/wordml" xmlns:w15="http://schemas.microsoft.com/office/word/2012/wordml" xmlns:w16cex="http://schemas.microsoft.com/office/word/2018/wordml/cex" xmlns:w16cid="http://schemas.microsoft.com/office/word/2016/wordml/cid" xmlns:w16="http://schemas.microsoft.com/office/word/2018/wordml" xmlns:w16sdtdh="http://schemas.microsoft.com/office/word/2020/wordml/sdtdatahash" xmlns:w16se="http://schemas.microsoft.com/office/word/2015/wordml/symex" mc:Ignorable="w14 w15 w16se w16cid w16 w16cex w16sdtdh">
+<w:styles xmlns:mc="http://schemas.openxmlformats.org/markup-compatibility/2006" xmlns:r="http://schemas.openxmlformats.org/officeDocument/2006/relationships" xmlns:w="http://schemas.openxmlformats.org/wordprocessingml/2006/main" xmlns:w14="http://schemas.microsoft.com/office/word/2010/wordml" xmlns:w15="http://schemas.microsoft.com/office/word/2012/wordml" xmlns:w16cex="http://schemas.microsoft.com/office/word/2018/wordml/cex" xmlns:w16cid="http://schemas.microsoft.com/office/word/2016/wordml/cid" xmlns:w16="http://schemas.microsoft.com/office/word/2018/wordml" xmlns:w16du="http://schemas.microsoft.com/office/word/2023/wordml/word16du" xmlns:w16sdtdh="http://schemas.microsoft.com/office/word/2020/wordml/sdtdatahash" xmlns:w16sdtfl="http://schemas.microsoft.com/office/word/2024/wordml/sdtformatlock" xmlns:w16se="http://schemas.microsoft.com/office/word/2015/wordml/symex" mc:Ignorable="w14 w15 w16se w16cid w16 w16cex w16sdtdh w16sdtfl w16du">
   <w:docDefaults>
     <w:rPrDefault>
       <w:rPr>

</xml_diff>